<commit_message>
Fix #3: something something
</commit_message>
<xml_diff>
--- a/URK24CS6009 BALAJI E.docx
+++ b/URK24CS6009 BALAJI E.docx
@@ -94,7 +94,7 @@
           <w:lang w:val="en-IN" w:eastAsia="en-IN"/>
         </w:rPr>
         <w:drawing>
-          <wp:anchor distT="0" distB="0" distL="0" distR="0" simplePos="0" relativeHeight="15731712" behindDoc="0" locked="0" layoutInCell="1" allowOverlap="1">
+          <wp:anchor distT="0" distB="0" distL="0" distR="0" simplePos="0" relativeHeight="15731712" behindDoc="0" locked="0" layoutInCell="1" allowOverlap="1" wp14:anchorId="199612B7" wp14:editId="2D58B965">
             <wp:simplePos x="0" y="0"/>
             <wp:positionH relativeFrom="page">
               <wp:posOffset>2571527</wp:posOffset>
@@ -137,23 +137,8 @@
           </wp:anchor>
         </w:drawing>
       </w:r>
-      <w:r>
-        <w:rPr>
-          <w:rFonts w:ascii="Trebuchet MS"/>
-          <w:w w:val="90"/>
-          <w:sz w:val="21"/>
-        </w:rPr>
-        <w:t>+91</w:t>
-      </w:r>
-      <w:r>
-        <w:rPr>
-          <w:rFonts w:ascii="Trebuchet MS"/>
-          <w:spacing w:val="-3"/>
-          <w:w w:val="90"/>
-          <w:sz w:val="21"/>
-        </w:rPr>
-        <w:t xml:space="preserve"> </w:t>
-      </w:r>
+      <w:bookmarkStart w:id="0" w:name="_GoBack"/>
+      <w:bookmarkEnd w:id="0"/>
       <w:r>
         <w:rPr>
           <w:rFonts w:ascii="Trebuchet MS"/>
@@ -381,7 +366,7 @@
           </mc:Choice>
           <mc:Fallback>
             <w:pict>
-              <v:shape w14:anchorId="1B15641D" id="Graphic 4" o:spid="_x0000_s1026" style="position:absolute;margin-left:195.35pt;margin-top:.55pt;width:20.25pt;height:17.25pt;z-index:15735296;visibility:visible;mso-wrap-style:square;mso-wrap-distance-left:0;mso-wrap-distance-top:0;mso-wrap-distance-right:0;mso-wrap-distance-bottom:0;mso-position-horizontal:absolute;mso-position-horizontal-relative:page;mso-position-vertical:absolute;mso-position-vertical-relative:text;v-text-anchor:top" coordsize="257175,219075" o:gfxdata="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" path="m218554,219074r-64280,l154274,141754r-51425,l102849,219074r-64281,l38568,115980,,115980,128561,,257123,115980r-38569,l218554,219074xe" fillcolor="black" stroked="f">
+              <v:shape w14:anchorId="6683B593" id="Graphic 4" o:spid="_x0000_s1026" style="position:absolute;margin-left:195.35pt;margin-top:.55pt;width:20.25pt;height:17.25pt;z-index:15735296;visibility:visible;mso-wrap-style:square;mso-wrap-distance-left:0;mso-wrap-distance-top:0;mso-wrap-distance-right:0;mso-wrap-distance-bottom:0;mso-position-horizontal:absolute;mso-position-horizontal-relative:page;mso-position-vertical:absolute;mso-position-vertical-relative:text;v-text-anchor:top" coordsize="257175,219075" o:gfxdata="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" path="m218554,219074r-64280,l154274,141754r-51425,l102849,219074r-64281,l38568,115980,,115980,128561,,257123,115980r-38569,l218554,219074xe" fillcolor="black" stroked="f">
                 <v:path arrowok="t"/>
                 <w10:wrap anchorx="page"/>
               </v:shape>
@@ -746,7 +731,7 @@
           </mc:Choice>
           <mc:Fallback>
             <w:pict>
-              <v:group w14:anchorId="323A0344" id="Group 6" o:spid="_x0000_s1026" style="width:490.95pt;height:.75pt;mso-position-horizontal-relative:char;mso-position-vertical-relative:line" coordsize="62350,95" o:gfxdata="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">
+              <v:group w14:anchorId="3582F331" id="Group 6" o:spid="_x0000_s1026" style="width:490.95pt;height:.75pt;mso-position-horizontal-relative:char;mso-position-vertical-relative:line" coordsize="62350,95" o:gfxdata="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">
                 <v:shape id="Graphic 7" o:spid="_x0000_s1027" style="position:absolute;top:47;width:62350;height:13;visibility:visible;mso-wrap-style:square;v-text-anchor:top" coordsize="6235065,1270" o:gfxdata="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" path="m6235007,l,e" filled="f" strokeweight=".26456mm">
                   <v:path arrowok="t"/>
                 </v:shape>
@@ -1338,7 +1323,7 @@
           </mc:Choice>
           <mc:Fallback>
             <w:pict>
-              <v:group w14:anchorId="5D95FB16" id="Group 8" o:spid="_x0000_s1026" style="width:490.95pt;height:.75pt;mso-position-horizontal-relative:char;mso-position-vertical-relative:line" coordsize="62350,95" o:gfxdata="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">
+              <v:group w14:anchorId="1201C240" id="Group 8" o:spid="_x0000_s1026" style="width:490.95pt;height:.75pt;mso-position-horizontal-relative:char;mso-position-vertical-relative:line" coordsize="62350,95" o:gfxdata="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">
                 <v:shape id="Graphic 9" o:spid="_x0000_s1027" style="position:absolute;top:47;width:62350;height:13;visibility:visible;mso-wrap-style:square;v-text-anchor:top" coordsize="6235065,1270" o:gfxdata="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" path="m6235007,l,e" filled="f" strokeweight=".26456mm">
                   <v:path arrowok="t"/>
                 </v:shape>
@@ -1696,7 +1681,7 @@
           </mc:Choice>
           <mc:Fallback>
             <w:pict>
-              <v:shape w14:anchorId="1B3DFF70" id="Graphic 10" o:spid="_x0000_s1026" style="position:absolute;margin-left:323.05pt;margin-top:-24.4pt;width:3pt;height:3pt;z-index:15736320;visibility:visible;mso-wrap-style:square;mso-wrap-distance-left:0;mso-wrap-distance-top:0;mso-wrap-distance-right:0;mso-wrap-distance-bottom:0;mso-position-horizontal:absolute;mso-position-horizontal-relative:page;mso-position-vertical:absolute;mso-position-vertical-relative:text;v-text-anchor:top" coordsize="38100,38100" o:gfxdata="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" path="m21576,38099r-5053,l14093,37616,,21576,,16523,16523,r5053,l38099,19049r,2527l21576,38099xe" fillcolor="black" stroked="f">
+              <v:shape w14:anchorId="79C2BBB6" id="Graphic 10" o:spid="_x0000_s1026" style="position:absolute;margin-left:323.05pt;margin-top:-24.4pt;width:3pt;height:3pt;z-index:15736320;visibility:visible;mso-wrap-style:square;mso-wrap-distance-left:0;mso-wrap-distance-top:0;mso-wrap-distance-right:0;mso-wrap-distance-bottom:0;mso-position-horizontal:absolute;mso-position-horizontal-relative:page;mso-position-vertical:absolute;mso-position-vertical-relative:text;v-text-anchor:top" coordsize="38100,38100" o:gfxdata="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" path="m21576,38099r-5053,l14093,37616,,21576,,16523,16523,r5053,l38099,19049r,2527l21576,38099xe" fillcolor="black" stroked="f">
                 <v:path arrowok="t"/>
                 <w10:wrap anchorx="page"/>
               </v:shape>
@@ -2069,7 +2054,7 @@
           </mc:Choice>
           <mc:Fallback>
             <w:pict>
-              <v:group w14:anchorId="7408A9A8" id="Group 12" o:spid="_x0000_s1026" style="width:490.95pt;height:.75pt;mso-position-horizontal-relative:char;mso-position-vertical-relative:line" coordsize="62350,95" o:gfxdata="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">
+              <v:group w14:anchorId="79277D4C" id="Group 12" o:spid="_x0000_s1026" style="width:490.95pt;height:.75pt;mso-position-horizontal-relative:char;mso-position-vertical-relative:line" coordsize="62350,95" o:gfxdata="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">
                 <v:shape id="Graphic 13" o:spid="_x0000_s1027" style="position:absolute;top:47;width:62350;height:13;visibility:visible;mso-wrap-style:square;v-text-anchor:top" coordsize="6235065,1270" o:gfxdata="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" path="m6235007,l,e" filled="f" strokeweight=".26456mm">
                   <v:path arrowok="t"/>
                 </v:shape>
@@ -2533,7 +2518,7 @@
           </mc:Choice>
           <mc:Fallback>
             <w:pict>
-              <v:shape w14:anchorId="1875F854" id="Graphic 17" o:spid="_x0000_s1026" style="position:absolute;margin-left:311.45pt;margin-top:13.65pt;width:3pt;height:3pt;z-index:15737344;visibility:visible;mso-wrap-style:square;mso-wrap-distance-left:0;mso-wrap-distance-top:0;mso-wrap-distance-right:0;mso-wrap-distance-bottom:0;mso-position-horizontal:absolute;mso-position-horizontal-relative:page;mso-position-vertical:absolute;mso-position-vertical-relative:text;v-text-anchor:top" coordsize="38100,38100" o:gfxdata="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" path="m21576,38099r-5053,l14093,37616,,21576,,16523,16523,r5053,l38099,19049r,2527l21576,38099xe" fillcolor="black" stroked="f">
+              <v:shape w14:anchorId="5FE614A9" id="Graphic 17" o:spid="_x0000_s1026" style="position:absolute;margin-left:311.45pt;margin-top:13.65pt;width:3pt;height:3pt;z-index:15737344;visibility:visible;mso-wrap-style:square;mso-wrap-distance-left:0;mso-wrap-distance-top:0;mso-wrap-distance-right:0;mso-wrap-distance-bottom:0;mso-position-horizontal:absolute;mso-position-horizontal-relative:page;mso-position-vertical:absolute;mso-position-vertical-relative:text;v-text-anchor:top" coordsize="38100,38100" o:gfxdata="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" path="m21576,38099r-5053,l14093,37616,,21576,,16523,16523,r5053,l38099,19049r,2527l21576,38099xe" fillcolor="black" stroked="f">
                 <v:path arrowok="t"/>
                 <w10:wrap anchorx="page"/>
               </v:shape>
@@ -2681,7 +2666,7 @@
           </mc:Choice>
           <mc:Fallback>
             <w:pict>
-              <v:shape w14:anchorId="2400331D" id="Graphic 18" o:spid="_x0000_s1026" style="position:absolute;margin-left:307.55pt;margin-top:10.6pt;width:3pt;height:3pt;z-index:15737856;visibility:visible;mso-wrap-style:square;mso-wrap-distance-left:0;mso-wrap-distance-top:0;mso-wrap-distance-right:0;mso-wrap-distance-bottom:0;mso-position-horizontal:absolute;mso-position-horizontal-relative:page;mso-position-vertical:absolute;mso-position-vertical-relative:text;v-text-anchor:top" coordsize="38100,38100" o:gfxdata="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" path="m21368,37733r-5004,l13958,37254,,21368,,16364,16364,r5004,l37733,18866r,2502l21368,37733xe" fillcolor="black" stroked="f">
+              <v:shape w14:anchorId="475B59BF" id="Graphic 18" o:spid="_x0000_s1026" style="position:absolute;margin-left:307.55pt;margin-top:10.6pt;width:3pt;height:3pt;z-index:15737856;visibility:visible;mso-wrap-style:square;mso-wrap-distance-left:0;mso-wrap-distance-top:0;mso-wrap-distance-right:0;mso-wrap-distance-bottom:0;mso-position-horizontal:absolute;mso-position-horizontal-relative:page;mso-position-vertical:absolute;mso-position-vertical-relative:text;v-text-anchor:top" coordsize="38100,38100" o:gfxdata="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" path="m21368,37733r-5004,l13958,37254,,21368,,16364,16364,r5004,l37733,18866r,2502l21368,37733xe" fillcolor="black" stroked="f">
                 <v:path arrowok="t"/>
                 <w10:wrap anchorx="page"/>
               </v:shape>
@@ -2953,7 +2938,7 @@
           </mc:Choice>
           <mc:Fallback>
             <w:pict>
-              <v:group w14:anchorId="444A503A" id="Group 19" o:spid="_x0000_s1026" style="width:490.95pt;height:.75pt;mso-position-horizontal-relative:char;mso-position-vertical-relative:line" coordsize="62350,95" o:gfxdata="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">
+              <v:group w14:anchorId="7D656CC9" id="Group 19" o:spid="_x0000_s1026" style="width:490.95pt;height:.75pt;mso-position-horizontal-relative:char;mso-position-vertical-relative:line" coordsize="62350,95" o:gfxdata="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">
                 <v:shape id="Graphic 20" o:spid="_x0000_s1027" style="position:absolute;top:47;width:62350;height:13;visibility:visible;mso-wrap-style:square;v-text-anchor:top" coordsize="6235065,1270" o:gfxdata="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" path="m6235007,l,e" filled="f" strokeweight=".26456mm">
                   <v:path arrowok="t"/>
                 </v:shape>
@@ -3078,7 +3063,7 @@
           </mc:Choice>
           <mc:Fallback>
             <w:pict>
-              <v:shape w14:anchorId="404E1C2B" id="Graphic 21" o:spid="_x0000_s1026" style="position:absolute;margin-left:54.2pt;margin-top:5.4pt;width:3pt;height:3pt;z-index:15736832;visibility:visible;mso-wrap-style:square;mso-wrap-distance-left:0;mso-wrap-distance-top:0;mso-wrap-distance-right:0;mso-wrap-distance-bottom:0;mso-position-horizontal:absolute;mso-position-horizontal-relative:page;mso-position-vertical:absolute;mso-position-vertical-relative:text;v-text-anchor:top" coordsize="38100,38100" o:gfxdata="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" path="m21576,38099r-5053,l14093,37616,,21576,,16523,16523,r5053,l38099,19049r,2527l21576,38099xe" fillcolor="black" stroked="f">
+              <v:shape w14:anchorId="1A4B2E9C" id="Graphic 21" o:spid="_x0000_s1026" style="position:absolute;margin-left:54.2pt;margin-top:5.4pt;width:3pt;height:3pt;z-index:15736832;visibility:visible;mso-wrap-style:square;mso-wrap-distance-left:0;mso-wrap-distance-top:0;mso-wrap-distance-right:0;mso-wrap-distance-bottom:0;mso-position-horizontal:absolute;mso-position-horizontal-relative:page;mso-position-vertical:absolute;mso-position-vertical-relative:text;v-text-anchor:top" coordsize="38100,38100" o:gfxdata="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" path="m21576,38099r-5053,l14093,37616,,21576,,16523,16523,r5053,l38099,19049r,2527l21576,38099xe" fillcolor="black" stroked="f">
                 <v:path arrowok="t"/>
                 <w10:wrap anchorx="page"/>
               </v:shape>
@@ -3314,7 +3299,7 @@
           </mc:Choice>
           <mc:Fallback>
             <w:pict>
-              <v:shape w14:anchorId="7D2E8BEC" id="Graphic 22" o:spid="_x0000_s1026" style="position:absolute;margin-left:54.35pt;margin-top:12.8pt;width:3.2pt;height:3.2pt;z-index:15738368;visibility:visible;mso-wrap-style:square;mso-wrap-distance-left:0;mso-wrap-distance-top:0;mso-wrap-distance-right:0;mso-wrap-distance-bottom:0;mso-position-horizontal:absolute;mso-position-horizontal-relative:page;mso-position-vertical:absolute;mso-position-vertical-relative:text;v-text-anchor:top" coordsize="40640,40640" o:gfxdata="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" path="m22852,40353r-5351,l14927,39841,,22852,,17501,17501,r5351,l40353,20176r,2676l22852,40353xe" fillcolor="black" stroked="f">
+              <v:shape w14:anchorId="6F92C90C" id="Graphic 22" o:spid="_x0000_s1026" style="position:absolute;margin-left:54.35pt;margin-top:12.8pt;width:3.2pt;height:3.2pt;z-index:15738368;visibility:visible;mso-wrap-style:square;mso-wrap-distance-left:0;mso-wrap-distance-top:0;mso-wrap-distance-right:0;mso-wrap-distance-bottom:0;mso-position-horizontal:absolute;mso-position-horizontal-relative:page;mso-position-vertical:absolute;mso-position-vertical-relative:text;v-text-anchor:top" coordsize="40640,40640" o:gfxdata="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" path="m22852,40353r-5351,l14927,39841,,22852,,17501,17501,r5351,l40353,20176r,2676l22852,40353xe" fillcolor="black" stroked="f">
                 <v:path arrowok="t"/>
                 <w10:wrap anchorx="page"/>
               </v:shape>
@@ -3583,7 +3568,7 @@
           </mc:Choice>
           <mc:Fallback>
             <w:pict>
-              <v:shape w14:anchorId="634FA3DE" id="Graphic 23" o:spid="_x0000_s1026" style="position:absolute;margin-left:53.8pt;margin-top:5.5pt;width:3.2pt;height:3.2pt;z-index:15739392;visibility:visible;mso-wrap-style:square;mso-wrap-distance-left:0;mso-wrap-distance-top:0;mso-wrap-distance-right:0;mso-wrap-distance-bottom:0;mso-position-horizontal:absolute;mso-position-horizontal-relative:page;mso-position-vertical:absolute;mso-position-vertical-relative:text;v-text-anchor:top" coordsize="40640,40640" o:gfxdata="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" path="m22852,40353r-5351,l14927,39841,,22852,,17501,17501,r5351,l40353,20176r,2676l22852,40353xe" fillcolor="black" stroked="f">
+              <v:shape w14:anchorId="7BF110E5" id="Graphic 23" o:spid="_x0000_s1026" style="position:absolute;margin-left:53.8pt;margin-top:5.5pt;width:3.2pt;height:3.2pt;z-index:15739392;visibility:visible;mso-wrap-style:square;mso-wrap-distance-left:0;mso-wrap-distance-top:0;mso-wrap-distance-right:0;mso-wrap-distance-bottom:0;mso-position-horizontal:absolute;mso-position-horizontal-relative:page;mso-position-vertical:absolute;mso-position-vertical-relative:text;v-text-anchor:top" coordsize="40640,40640" o:gfxdata="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" path="m22852,40353r-5351,l14927,39841,,22852,,17501,17501,r5351,l40353,20176r,2676l22852,40353xe" fillcolor="black" stroked="f">
                 <v:path arrowok="t"/>
                 <w10:wrap anchorx="page"/>
               </v:shape>
@@ -3818,7 +3803,7 @@
           </mc:Choice>
           <mc:Fallback>
             <w:pict>
-              <v:shape w14:anchorId="06D0762E" id="Graphic 24" o:spid="_x0000_s1026" style="position:absolute;margin-left:53.8pt;margin-top:10.6pt;width:3.2pt;height:3.2pt;z-index:15738880;visibility:visible;mso-wrap-style:square;mso-wrap-distance-left:0;mso-wrap-distance-top:0;mso-wrap-distance-right:0;mso-wrap-distance-bottom:0;mso-position-horizontal:absolute;mso-position-horizontal-relative:page;mso-position-vertical:absolute;mso-position-vertical-relative:text;v-text-anchor:top" coordsize="40640,40640" o:gfxdata="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" path="m22852,40353r-5351,l14927,39841,,22852,,17501,17501,r5351,l40353,20176r,2676l22852,40353xe" fillcolor="black" stroked="f">
+              <v:shape w14:anchorId="738A339E" id="Graphic 24" o:spid="_x0000_s1026" style="position:absolute;margin-left:53.8pt;margin-top:10.6pt;width:3.2pt;height:3.2pt;z-index:15738880;visibility:visible;mso-wrap-style:square;mso-wrap-distance-left:0;mso-wrap-distance-top:0;mso-wrap-distance-right:0;mso-wrap-distance-bottom:0;mso-position-horizontal:absolute;mso-position-horizontal-relative:page;mso-position-vertical:absolute;mso-position-vertical-relative:text;v-text-anchor:top" coordsize="40640,40640" o:gfxdata="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" path="m22852,40353r-5351,l14927,39841,,22852,,17501,17501,r5351,l40353,20176r,2676l22852,40353xe" fillcolor="black" stroked="f">
                 <v:path arrowok="t"/>
                 <w10:wrap anchorx="page"/>
               </v:shape>
@@ -4053,7 +4038,7 @@
           </mc:Choice>
           <mc:Fallback>
             <w:pict>
-              <v:shape w14:anchorId="51BAAC2F" id="Graphic 25" o:spid="_x0000_s1026" style="position:absolute;margin-left:211.85pt;margin-top:-11.1pt;width:63.4pt;height:5.1pt;z-index:15732736;visibility:visible;mso-wrap-style:square;mso-wrap-distance-left:0;mso-wrap-distance-top:0;mso-wrap-distance-right:0;mso-wrap-distance-bottom:0;mso-position-horizontal:absolute;mso-position-horizontal-relative:page;mso-position-vertical:absolute;mso-position-vertical-relative:text;v-text-anchor:top" coordsize="805180,64769" o:gfxdata="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" path="m804811,32194l802271,19659,795375,9436,785139,2540,772617,,32194,,19659,2540,9423,9436,2527,19659,,32194,2527,44729,9423,54965r10236,6896l32194,64389r740423,l785139,61861r10236,-6896l802271,44729r2540,-12535xe" fillcolor="black" stroked="f">
+              <v:shape w14:anchorId="093CC52F" id="Graphic 25" o:spid="_x0000_s1026" style="position:absolute;margin-left:211.85pt;margin-top:-11.1pt;width:63.4pt;height:5.1pt;z-index:15732736;visibility:visible;mso-wrap-style:square;mso-wrap-distance-left:0;mso-wrap-distance-top:0;mso-wrap-distance-right:0;mso-wrap-distance-bottom:0;mso-position-horizontal:absolute;mso-position-horizontal-relative:page;mso-position-vertical:absolute;mso-position-vertical-relative:text;v-text-anchor:top" coordsize="805180,64769" o:gfxdata="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" path="m804811,32194l802271,19659,795375,9436,785139,2540,772617,,32194,,19659,2540,9423,9436,2527,19659,,32194,2527,44729,9423,54965r10236,6896l32194,64389r740423,l785139,61861r10236,-6896l802271,44729r2540,-12535xe" fillcolor="black" stroked="f">
                 <v:path arrowok="t"/>
                 <w10:wrap anchorx="page"/>
               </v:shape>
@@ -4241,7 +4226,7 @@
           </mc:Choice>
           <mc:Fallback>
             <w:pict>
-              <v:group w14:anchorId="0A3A3610" id="Group 26" o:spid="_x0000_s1026" style="position:absolute;margin-left:211.85pt;margin-top:10.75pt;width:63.4pt;height:4.45pt;z-index:15733248;mso-wrap-distance-left:0;mso-wrap-distance-right:0;mso-position-horizontal-relative:page" coordsize="8051,565" o:gfxdata="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">
+              <v:group w14:anchorId="6B0D5BEB" id="Group 26" o:spid="_x0000_s1026" style="position:absolute;margin-left:211.85pt;margin-top:10.75pt;width:63.4pt;height:4.45pt;z-index:15733248;mso-wrap-distance-left:0;mso-wrap-distance-right:0;mso-position-horizontal-relative:page" coordsize="8051,565" o:gfxdata="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">
                 <v:shape id="Graphic 27" o:spid="_x0000_s1027" style="position:absolute;left:7645;width:407;height:565;visibility:visible;mso-wrap-style:square;v-text-anchor:top" coordsize="40640,56515" o:gfxdata="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" path="m,56336r40240,l40240,,,,,56336xe" fillcolor="#e3e8e9" stroked="f">
                   <v:path arrowok="t"/>
                 </v:shape>
@@ -4493,7 +4478,7 @@
           </mc:Choice>
           <mc:Fallback>
             <w:pict>
-              <v:group w14:anchorId="6E6D2F54" id="Group 29" o:spid="_x0000_s1026" style="position:absolute;margin-left:212.5pt;margin-top:8.95pt;width:63.4pt;height:5.1pt;z-index:15733760;mso-wrap-distance-left:0;mso-wrap-distance-right:0;mso-position-horizontal-relative:page" coordsize="8051,647" o:gfxdata="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">
+              <v:group w14:anchorId="7FD12DCE" id="Group 29" o:spid="_x0000_s1026" style="position:absolute;margin-left:212.5pt;margin-top:8.95pt;width:63.4pt;height:5.1pt;z-index:15733760;mso-wrap-distance-left:0;mso-wrap-distance-right:0;mso-position-horizontal-relative:page" coordsize="8051,647" o:gfxdata="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">
                 <v:shape id="Graphic 30" o:spid="_x0000_s1027" style="position:absolute;width:8051;height:647;visibility:visible;mso-wrap-style:square;v-text-anchor:top" coordsize="805180,64769" o:gfxdata="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" path="m772616,64384r-740424,l19661,61854,9428,54955,2529,44723,,32192,2529,19661,9428,9429,19661,2529,32192,,772616,r12531,2529l795380,9429r6899,10232l804809,32192r-2530,12531l795380,54955r-10233,6899l772616,64384xe" fillcolor="#e3e8e9" stroked="f">
                   <v:path arrowok="t"/>
                 </v:shape>
@@ -4745,7 +4730,7 @@
           </mc:Choice>
           <mc:Fallback>
             <w:pict>
-              <v:group w14:anchorId="6F7C5D80" id="Group 32" o:spid="_x0000_s1026" style="position:absolute;margin-left:212.5pt;margin-top:14.15pt;width:63.4pt;height:4.45pt;z-index:15734272;mso-wrap-distance-left:0;mso-wrap-distance-right:0;mso-position-horizontal-relative:page" coordsize="8051,565" o:gfxdata="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">
+              <v:group w14:anchorId="362FFD28" id="Group 32" o:spid="_x0000_s1026" style="position:absolute;margin-left:212.5pt;margin-top:14.15pt;width:63.4pt;height:4.45pt;z-index:15734272;mso-wrap-distance-left:0;mso-wrap-distance-right:0;mso-position-horizontal-relative:page" coordsize="8051,565" o:gfxdata="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">
                 <v:shape id="Graphic 33" o:spid="_x0000_s1027" style="position:absolute;width:8051;height:565;visibility:visible;mso-wrap-style:square;v-text-anchor:top" coordsize="805180,56515" o:gfxdata="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" path="m776640,56336r-748472,l17203,54123,8250,48086,2213,39132,,28168,2213,17203,8250,8250,17203,2213,28168,,776640,r10965,2213l796558,8250r6037,8953l804809,28168r-2214,10964l796558,48086r-8953,6037l776640,56336xe" fillcolor="#e3e8e9" stroked="f">
                   <v:path arrowok="t"/>
                 </v:shape>
@@ -4873,7 +4858,7 @@
           </mc:Choice>
           <mc:Fallback>
             <w:pict>
-              <v:shape w14:anchorId="7FB50BB4" id="Graphic 35" o:spid="_x0000_s1026" style="position:absolute;margin-left:0;margin-top:172.25pt;width:595.5pt;height:3pt;z-index:15734784;visibility:visible;mso-wrap-style:square;mso-wrap-distance-left:0;mso-wrap-distance-top:0;mso-wrap-distance-right:0;mso-wrap-distance-bottom:0;mso-position-horizontal:absolute;mso-position-horizontal-relative:page;mso-position-vertical:absolute;mso-position-vertical-relative:page;v-text-anchor:top" coordsize="7562850,38100" o:gfxdata="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" path="m7562849,r,38099l,38099,,,7562849,xe" fillcolor="black" stroked="f">
+              <v:shape w14:anchorId="0075F0AD" id="Graphic 35" o:spid="_x0000_s1026" style="position:absolute;margin-left:0;margin-top:172.25pt;width:595.5pt;height:3pt;z-index:15734784;visibility:visible;mso-wrap-style:square;mso-wrap-distance-left:0;mso-wrap-distance-top:0;mso-wrap-distance-right:0;mso-wrap-distance-bottom:0;mso-position-horizontal:absolute;mso-position-horizontal-relative:page;mso-position-vertical:absolute;mso-position-vertical-relative:page;v-text-anchor:top" coordsize="7562850,38100" o:gfxdata="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" path="m7562849,r,38099l,38099,,,7562849,xe" fillcolor="black" stroked="f">
                 <v:path arrowok="t"/>
                 <w10:wrap anchorx="page" anchory="page"/>
               </v:shape>
@@ -4968,7 +4953,7 @@
           </mc:Choice>
           <mc:Fallback>
             <w:pict>
-              <v:group w14:anchorId="1F8C7828" id="Group 36" o:spid="_x0000_s1026" style="width:490.95pt;height:.75pt;mso-position-horizontal-relative:char;mso-position-vertical-relative:line" coordsize="62350,95" o:gfxdata="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">
+              <v:group w14:anchorId="47A1FDC7" id="Group 36" o:spid="_x0000_s1026" style="width:490.95pt;height:.75pt;mso-position-horizontal-relative:char;mso-position-vertical-relative:line" coordsize="62350,95" o:gfxdata="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">
                 <v:shape id="Graphic 37" o:spid="_x0000_s1027" style="position:absolute;top:47;width:62350;height:13;visibility:visible;mso-wrap-style:square;v-text-anchor:top" coordsize="6235065,1270" o:gfxdata="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" path="m6235007,l,e" filled="f" strokeweight=".26456mm">
                   <v:path arrowok="t"/>
                 </v:shape>
@@ -5014,8 +4999,6 @@
         </w:rPr>
         <w:t>YOU!!!!!</w:t>
       </w:r>
-      <w:bookmarkStart w:id="0" w:name="_GoBack"/>
-      <w:bookmarkEnd w:id="0"/>
     </w:p>
     <w:sectPr>
       <w:type w:val="continuous"/>

</xml_diff>

<commit_message>
Fix #5: everything done
</commit_message>
<xml_diff>
--- a/URK24CS6009 BALAJI E.docx
+++ b/URK24CS6009 BALAJI E.docx
@@ -137,6 +137,15 @@
           </wp:anchor>
         </w:drawing>
       </w:r>
+      <w:r>
+        <w:rPr>
+          <w:rFonts w:ascii="Trebuchet MS"/>
+          <w:spacing w:val="-2"/>
+          <w:w w:val="105"/>
+          <w:sz w:val="21"/>
+        </w:rPr>
+        <w:t>+91</w:t>
+      </w:r>
       <w:bookmarkStart w:id="0" w:name="_GoBack"/>
       <w:bookmarkEnd w:id="0"/>
       <w:r>
@@ -375,7 +384,7 @@
           </mc:Choice>
           <mc:Fallback>
             <w:pict>
-              <v:shape w14:anchorId="0C251212" id="Graphic 4" o:spid="_x0000_s1026" style="position:absolute;margin-left:195.35pt;margin-top:.55pt;width:20.25pt;height:17.25pt;z-index:15735296;visibility:visible;mso-wrap-style:square;mso-wrap-distance-left:0;mso-wrap-distance-top:0;mso-wrap-distance-right:0;mso-wrap-distance-bottom:0;mso-position-horizontal:absolute;mso-position-horizontal-relative:page;mso-position-vertical:absolute;mso-position-vertical-relative:text;v-text-anchor:top" coordsize="257175,219075" o:gfxdata="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" path="m218554,219074r-64280,l154274,141754r-51425,l102849,219074r-64281,l38568,115980,,115980,128561,,257123,115980r-38569,l218554,219074xe" fillcolor="black" stroked="f">
+              <v:shape w14:anchorId="6791CFFB" id="Graphic 4" o:spid="_x0000_s1026" style="position:absolute;margin-left:195.35pt;margin-top:.55pt;width:20.25pt;height:17.25pt;z-index:15735296;visibility:visible;mso-wrap-style:square;mso-wrap-distance-left:0;mso-wrap-distance-top:0;mso-wrap-distance-right:0;mso-wrap-distance-bottom:0;mso-position-horizontal:absolute;mso-position-horizontal-relative:page;mso-position-vertical:absolute;mso-position-vertical-relative:text;v-text-anchor:top" coordsize="257175,219075" o:gfxdata="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" path="m218554,219074r-64280,l154274,141754r-51425,l102849,219074r-64281,l38568,115980,,115980,128561,,257123,115980r-38569,l218554,219074xe" fillcolor="black" stroked="f">
                 <v:path arrowok="t"/>
                 <w10:wrap anchorx="page"/>
               </v:shape>
@@ -740,7 +749,7 @@
           </mc:Choice>
           <mc:Fallback>
             <w:pict>
-              <v:group w14:anchorId="240B475D" id="Group 6" o:spid="_x0000_s1026" style="width:490.95pt;height:.75pt;mso-position-horizontal-relative:char;mso-position-vertical-relative:line" coordsize="62350,95" o:gfxdata="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">
+              <v:group w14:anchorId="7C3B717D" id="Group 6" o:spid="_x0000_s1026" style="width:490.95pt;height:.75pt;mso-position-horizontal-relative:char;mso-position-vertical-relative:line" coordsize="62350,95" o:gfxdata="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">
                 <v:shape id="Graphic 7" o:spid="_x0000_s1027" style="position:absolute;top:47;width:62350;height:13;visibility:visible;mso-wrap-style:square;v-text-anchor:top" coordsize="6235065,1270" o:gfxdata="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" path="m6235007,l,e" filled="f" strokeweight=".26456mm">
                   <v:path arrowok="t"/>
                 </v:shape>
@@ -1332,7 +1341,7 @@
           </mc:Choice>
           <mc:Fallback>
             <w:pict>
-              <v:group w14:anchorId="6A925209" id="Group 8" o:spid="_x0000_s1026" style="width:490.95pt;height:.75pt;mso-position-horizontal-relative:char;mso-position-vertical-relative:line" coordsize="62350,95" o:gfxdata="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">
+              <v:group w14:anchorId="687030AA" id="Group 8" o:spid="_x0000_s1026" style="width:490.95pt;height:.75pt;mso-position-horizontal-relative:char;mso-position-vertical-relative:line" coordsize="62350,95" o:gfxdata="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">
                 <v:shape id="Graphic 9" o:spid="_x0000_s1027" style="position:absolute;top:47;width:62350;height:13;visibility:visible;mso-wrap-style:square;v-text-anchor:top" coordsize="6235065,1270" o:gfxdata="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" path="m6235007,l,e" filled="f" strokeweight=".26456mm">
                   <v:path arrowok="t"/>
                 </v:shape>
@@ -1690,7 +1699,7 @@
           </mc:Choice>
           <mc:Fallback>
             <w:pict>
-              <v:shape w14:anchorId="554AF6F9" id="Graphic 10" o:spid="_x0000_s1026" style="position:absolute;margin-left:323.05pt;margin-top:-24.4pt;width:3pt;height:3pt;z-index:15736320;visibility:visible;mso-wrap-style:square;mso-wrap-distance-left:0;mso-wrap-distance-top:0;mso-wrap-distance-right:0;mso-wrap-distance-bottom:0;mso-position-horizontal:absolute;mso-position-horizontal-relative:page;mso-position-vertical:absolute;mso-position-vertical-relative:text;v-text-anchor:top" coordsize="38100,38100" o:gfxdata="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" path="m21576,38099r-5053,l14093,37616,,21576,,16523,16523,r5053,l38099,19049r,2527l21576,38099xe" fillcolor="black" stroked="f">
+              <v:shape w14:anchorId="49B115EA" id="Graphic 10" o:spid="_x0000_s1026" style="position:absolute;margin-left:323.05pt;margin-top:-24.4pt;width:3pt;height:3pt;z-index:15736320;visibility:visible;mso-wrap-style:square;mso-wrap-distance-left:0;mso-wrap-distance-top:0;mso-wrap-distance-right:0;mso-wrap-distance-bottom:0;mso-position-horizontal:absolute;mso-position-horizontal-relative:page;mso-position-vertical:absolute;mso-position-vertical-relative:text;v-text-anchor:top" coordsize="38100,38100" o:gfxdata="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" path="m21576,38099r-5053,l14093,37616,,21576,,16523,16523,r5053,l38099,19049r,2527l21576,38099xe" fillcolor="black" stroked="f">
                 <v:path arrowok="t"/>
                 <w10:wrap anchorx="page"/>
               </v:shape>
@@ -2063,7 +2072,7 @@
           </mc:Choice>
           <mc:Fallback>
             <w:pict>
-              <v:group w14:anchorId="4974997C" id="Group 12" o:spid="_x0000_s1026" style="width:490.95pt;height:.75pt;mso-position-horizontal-relative:char;mso-position-vertical-relative:line" coordsize="62350,95" o:gfxdata="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">
+              <v:group w14:anchorId="600F131C" id="Group 12" o:spid="_x0000_s1026" style="width:490.95pt;height:.75pt;mso-position-horizontal-relative:char;mso-position-vertical-relative:line" coordsize="62350,95" o:gfxdata="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">
                 <v:shape id="Graphic 13" o:spid="_x0000_s1027" style="position:absolute;top:47;width:62350;height:13;visibility:visible;mso-wrap-style:square;v-text-anchor:top" coordsize="6235065,1270" o:gfxdata="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" path="m6235007,l,e" filled="f" strokeweight=".26456mm">
                   <v:path arrowok="t"/>
                 </v:shape>
@@ -2527,7 +2536,7 @@
           </mc:Choice>
           <mc:Fallback>
             <w:pict>
-              <v:shape w14:anchorId="5DDC9922" id="Graphic 17" o:spid="_x0000_s1026" style="position:absolute;margin-left:311.45pt;margin-top:13.65pt;width:3pt;height:3pt;z-index:15737344;visibility:visible;mso-wrap-style:square;mso-wrap-distance-left:0;mso-wrap-distance-top:0;mso-wrap-distance-right:0;mso-wrap-distance-bottom:0;mso-position-horizontal:absolute;mso-position-horizontal-relative:page;mso-position-vertical:absolute;mso-position-vertical-relative:text;v-text-anchor:top" coordsize="38100,38100" o:gfxdata="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" path="m21576,38099r-5053,l14093,37616,,21576,,16523,16523,r5053,l38099,19049r,2527l21576,38099xe" fillcolor="black" stroked="f">
+              <v:shape w14:anchorId="3EB0E5CF" id="Graphic 17" o:spid="_x0000_s1026" style="position:absolute;margin-left:311.45pt;margin-top:13.65pt;width:3pt;height:3pt;z-index:15737344;visibility:visible;mso-wrap-style:square;mso-wrap-distance-left:0;mso-wrap-distance-top:0;mso-wrap-distance-right:0;mso-wrap-distance-bottom:0;mso-position-horizontal:absolute;mso-position-horizontal-relative:page;mso-position-vertical:absolute;mso-position-vertical-relative:text;v-text-anchor:top" coordsize="38100,38100" o:gfxdata="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" path="m21576,38099r-5053,l14093,37616,,21576,,16523,16523,r5053,l38099,19049r,2527l21576,38099xe" fillcolor="black" stroked="f">
                 <v:path arrowok="t"/>
                 <w10:wrap anchorx="page"/>
               </v:shape>
@@ -2675,7 +2684,7 @@
           </mc:Choice>
           <mc:Fallback>
             <w:pict>
-              <v:shape w14:anchorId="38715A2C" id="Graphic 18" o:spid="_x0000_s1026" style="position:absolute;margin-left:307.55pt;margin-top:10.6pt;width:3pt;height:3pt;z-index:15737856;visibility:visible;mso-wrap-style:square;mso-wrap-distance-left:0;mso-wrap-distance-top:0;mso-wrap-distance-right:0;mso-wrap-distance-bottom:0;mso-position-horizontal:absolute;mso-position-horizontal-relative:page;mso-position-vertical:absolute;mso-position-vertical-relative:text;v-text-anchor:top" coordsize="38100,38100" o:gfxdata="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" path="m21368,37733r-5004,l13958,37254,,21368,,16364,16364,r5004,l37733,18866r,2502l21368,37733xe" fillcolor="black" stroked="f">
+              <v:shape w14:anchorId="4E734E0F" id="Graphic 18" o:spid="_x0000_s1026" style="position:absolute;margin-left:307.55pt;margin-top:10.6pt;width:3pt;height:3pt;z-index:15737856;visibility:visible;mso-wrap-style:square;mso-wrap-distance-left:0;mso-wrap-distance-top:0;mso-wrap-distance-right:0;mso-wrap-distance-bottom:0;mso-position-horizontal:absolute;mso-position-horizontal-relative:page;mso-position-vertical:absolute;mso-position-vertical-relative:text;v-text-anchor:top" coordsize="38100,38100" o:gfxdata="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" path="m21368,37733r-5004,l13958,37254,,21368,,16364,16364,r5004,l37733,18866r,2502l21368,37733xe" fillcolor="black" stroked="f">
                 <v:path arrowok="t"/>
                 <w10:wrap anchorx="page"/>
               </v:shape>
@@ -2947,7 +2956,7 @@
           </mc:Choice>
           <mc:Fallback>
             <w:pict>
-              <v:group w14:anchorId="096793CD" id="Group 19" o:spid="_x0000_s1026" style="width:490.95pt;height:.75pt;mso-position-horizontal-relative:char;mso-position-vertical-relative:line" coordsize="62350,95" o:gfxdata="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">
+              <v:group w14:anchorId="5B3F90BE" id="Group 19" o:spid="_x0000_s1026" style="width:490.95pt;height:.75pt;mso-position-horizontal-relative:char;mso-position-vertical-relative:line" coordsize="62350,95" o:gfxdata="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">
                 <v:shape id="Graphic 20" o:spid="_x0000_s1027" style="position:absolute;top:47;width:62350;height:13;visibility:visible;mso-wrap-style:square;v-text-anchor:top" coordsize="6235065,1270" o:gfxdata="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" path="m6235007,l,e" filled="f" strokeweight=".26456mm">
                   <v:path arrowok="t"/>
                 </v:shape>
@@ -3072,7 +3081,7 @@
           </mc:Choice>
           <mc:Fallback>
             <w:pict>
-              <v:shape w14:anchorId="5C4238F0" id="Graphic 21" o:spid="_x0000_s1026" style="position:absolute;margin-left:54.2pt;margin-top:5.4pt;width:3pt;height:3pt;z-index:15736832;visibility:visible;mso-wrap-style:square;mso-wrap-distance-left:0;mso-wrap-distance-top:0;mso-wrap-distance-right:0;mso-wrap-distance-bottom:0;mso-position-horizontal:absolute;mso-position-horizontal-relative:page;mso-position-vertical:absolute;mso-position-vertical-relative:text;v-text-anchor:top" coordsize="38100,38100" o:gfxdata="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" path="m21576,38099r-5053,l14093,37616,,21576,,16523,16523,r5053,l38099,19049r,2527l21576,38099xe" fillcolor="black" stroked="f">
+              <v:shape w14:anchorId="497505EA" id="Graphic 21" o:spid="_x0000_s1026" style="position:absolute;margin-left:54.2pt;margin-top:5.4pt;width:3pt;height:3pt;z-index:15736832;visibility:visible;mso-wrap-style:square;mso-wrap-distance-left:0;mso-wrap-distance-top:0;mso-wrap-distance-right:0;mso-wrap-distance-bottom:0;mso-position-horizontal:absolute;mso-position-horizontal-relative:page;mso-position-vertical:absolute;mso-position-vertical-relative:text;v-text-anchor:top" coordsize="38100,38100" o:gfxdata="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" path="m21576,38099r-5053,l14093,37616,,21576,,16523,16523,r5053,l38099,19049r,2527l21576,38099xe" fillcolor="black" stroked="f">
                 <v:path arrowok="t"/>
                 <w10:wrap anchorx="page"/>
               </v:shape>
@@ -3308,7 +3317,7 @@
           </mc:Choice>
           <mc:Fallback>
             <w:pict>
-              <v:shape w14:anchorId="4E4C5544" id="Graphic 22" o:spid="_x0000_s1026" style="position:absolute;margin-left:54.35pt;margin-top:12.8pt;width:3.2pt;height:3.2pt;z-index:15738368;visibility:visible;mso-wrap-style:square;mso-wrap-distance-left:0;mso-wrap-distance-top:0;mso-wrap-distance-right:0;mso-wrap-distance-bottom:0;mso-position-horizontal:absolute;mso-position-horizontal-relative:page;mso-position-vertical:absolute;mso-position-vertical-relative:text;v-text-anchor:top" coordsize="40640,40640" o:gfxdata="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" path="m22852,40353r-5351,l14927,39841,,22852,,17501,17501,r5351,l40353,20176r,2676l22852,40353xe" fillcolor="black" stroked="f">
+              <v:shape w14:anchorId="06903CE4" id="Graphic 22" o:spid="_x0000_s1026" style="position:absolute;margin-left:54.35pt;margin-top:12.8pt;width:3.2pt;height:3.2pt;z-index:15738368;visibility:visible;mso-wrap-style:square;mso-wrap-distance-left:0;mso-wrap-distance-top:0;mso-wrap-distance-right:0;mso-wrap-distance-bottom:0;mso-position-horizontal:absolute;mso-position-horizontal-relative:page;mso-position-vertical:absolute;mso-position-vertical-relative:text;v-text-anchor:top" coordsize="40640,40640" o:gfxdata="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" path="m22852,40353r-5351,l14927,39841,,22852,,17501,17501,r5351,l40353,20176r,2676l22852,40353xe" fillcolor="black" stroked="f">
                 <v:path arrowok="t"/>
                 <w10:wrap anchorx="page"/>
               </v:shape>
@@ -3577,7 +3586,7 @@
           </mc:Choice>
           <mc:Fallback>
             <w:pict>
-              <v:shape w14:anchorId="28405F2C" id="Graphic 23" o:spid="_x0000_s1026" style="position:absolute;margin-left:53.8pt;margin-top:5.5pt;width:3.2pt;height:3.2pt;z-index:15739392;visibility:visible;mso-wrap-style:square;mso-wrap-distance-left:0;mso-wrap-distance-top:0;mso-wrap-distance-right:0;mso-wrap-distance-bottom:0;mso-position-horizontal:absolute;mso-position-horizontal-relative:page;mso-position-vertical:absolute;mso-position-vertical-relative:text;v-text-anchor:top" coordsize="40640,40640" o:gfxdata="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" path="m22852,40353r-5351,l14927,39841,,22852,,17501,17501,r5351,l40353,20176r,2676l22852,40353xe" fillcolor="black" stroked="f">
+              <v:shape w14:anchorId="13E0DC87" id="Graphic 23" o:spid="_x0000_s1026" style="position:absolute;margin-left:53.8pt;margin-top:5.5pt;width:3.2pt;height:3.2pt;z-index:15739392;visibility:visible;mso-wrap-style:square;mso-wrap-distance-left:0;mso-wrap-distance-top:0;mso-wrap-distance-right:0;mso-wrap-distance-bottom:0;mso-position-horizontal:absolute;mso-position-horizontal-relative:page;mso-position-vertical:absolute;mso-position-vertical-relative:text;v-text-anchor:top" coordsize="40640,40640" o:gfxdata="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" path="m22852,40353r-5351,l14927,39841,,22852,,17501,17501,r5351,l40353,20176r,2676l22852,40353xe" fillcolor="black" stroked="f">
                 <v:path arrowok="t"/>
                 <w10:wrap anchorx="page"/>
               </v:shape>
@@ -3812,7 +3821,7 @@
           </mc:Choice>
           <mc:Fallback>
             <w:pict>
-              <v:shape w14:anchorId="7CE5DAB1" id="Graphic 24" o:spid="_x0000_s1026" style="position:absolute;margin-left:53.8pt;margin-top:10.6pt;width:3.2pt;height:3.2pt;z-index:15738880;visibility:visible;mso-wrap-style:square;mso-wrap-distance-left:0;mso-wrap-distance-top:0;mso-wrap-distance-right:0;mso-wrap-distance-bottom:0;mso-position-horizontal:absolute;mso-position-horizontal-relative:page;mso-position-vertical:absolute;mso-position-vertical-relative:text;v-text-anchor:top" coordsize="40640,40640" o:gfxdata="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" path="m22852,40353r-5351,l14927,39841,,22852,,17501,17501,r5351,l40353,20176r,2676l22852,40353xe" fillcolor="black" stroked="f">
+              <v:shape w14:anchorId="476DB028" id="Graphic 24" o:spid="_x0000_s1026" style="position:absolute;margin-left:53.8pt;margin-top:10.6pt;width:3.2pt;height:3.2pt;z-index:15738880;visibility:visible;mso-wrap-style:square;mso-wrap-distance-left:0;mso-wrap-distance-top:0;mso-wrap-distance-right:0;mso-wrap-distance-bottom:0;mso-position-horizontal:absolute;mso-position-horizontal-relative:page;mso-position-vertical:absolute;mso-position-vertical-relative:text;v-text-anchor:top" coordsize="40640,40640" o:gfxdata="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" path="m22852,40353r-5351,l14927,39841,,22852,,17501,17501,r5351,l40353,20176r,2676l22852,40353xe" fillcolor="black" stroked="f">
                 <v:path arrowok="t"/>
                 <w10:wrap anchorx="page"/>
               </v:shape>
@@ -4047,7 +4056,7 @@
           </mc:Choice>
           <mc:Fallback>
             <w:pict>
-              <v:shape w14:anchorId="15989C71" id="Graphic 25" o:spid="_x0000_s1026" style="position:absolute;margin-left:211.85pt;margin-top:-11.1pt;width:63.4pt;height:5.1pt;z-index:15732736;visibility:visible;mso-wrap-style:square;mso-wrap-distance-left:0;mso-wrap-distance-top:0;mso-wrap-distance-right:0;mso-wrap-distance-bottom:0;mso-position-horizontal:absolute;mso-position-horizontal-relative:page;mso-position-vertical:absolute;mso-position-vertical-relative:text;v-text-anchor:top" coordsize="805180,64769" o:gfxdata="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" path="m804811,32194l802271,19659,795375,9436,785139,2540,772617,,32194,,19659,2540,9423,9436,2527,19659,,32194,2527,44729,9423,54965r10236,6896l32194,64389r740423,l785139,61861r10236,-6896l802271,44729r2540,-12535xe" fillcolor="black" stroked="f">
+              <v:shape w14:anchorId="30B1F01F" id="Graphic 25" o:spid="_x0000_s1026" style="position:absolute;margin-left:211.85pt;margin-top:-11.1pt;width:63.4pt;height:5.1pt;z-index:15732736;visibility:visible;mso-wrap-style:square;mso-wrap-distance-left:0;mso-wrap-distance-top:0;mso-wrap-distance-right:0;mso-wrap-distance-bottom:0;mso-position-horizontal:absolute;mso-position-horizontal-relative:page;mso-position-vertical:absolute;mso-position-vertical-relative:text;v-text-anchor:top" coordsize="805180,64769" o:gfxdata="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" path="m804811,32194l802271,19659,795375,9436,785139,2540,772617,,32194,,19659,2540,9423,9436,2527,19659,,32194,2527,44729,9423,54965r10236,6896l32194,64389r740423,l785139,61861r10236,-6896l802271,44729r2540,-12535xe" fillcolor="black" stroked="f">
                 <v:path arrowok="t"/>
                 <w10:wrap anchorx="page"/>
               </v:shape>
@@ -4235,7 +4244,7 @@
           </mc:Choice>
           <mc:Fallback>
             <w:pict>
-              <v:group w14:anchorId="4D9B16AC" id="Group 26" o:spid="_x0000_s1026" style="position:absolute;margin-left:211.85pt;margin-top:10.75pt;width:63.4pt;height:4.45pt;z-index:15733248;mso-wrap-distance-left:0;mso-wrap-distance-right:0;mso-position-horizontal-relative:page" coordsize="8051,565" o:gfxdata="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">
+              <v:group w14:anchorId="52DAC1D9" id="Group 26" o:spid="_x0000_s1026" style="position:absolute;margin-left:211.85pt;margin-top:10.75pt;width:63.4pt;height:4.45pt;z-index:15733248;mso-wrap-distance-left:0;mso-wrap-distance-right:0;mso-position-horizontal-relative:page" coordsize="8051,565" o:gfxdata="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">
                 <v:shape id="Graphic 27" o:spid="_x0000_s1027" style="position:absolute;left:7645;width:407;height:565;visibility:visible;mso-wrap-style:square;v-text-anchor:top" coordsize="40640,56515" o:gfxdata="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" path="m,56336r40240,l40240,,,,,56336xe" fillcolor="#e3e8e9" stroked="f">
                   <v:path arrowok="t"/>
                 </v:shape>
@@ -4487,7 +4496,7 @@
           </mc:Choice>
           <mc:Fallback>
             <w:pict>
-              <v:group w14:anchorId="7433829C" id="Group 29" o:spid="_x0000_s1026" style="position:absolute;margin-left:212.5pt;margin-top:8.95pt;width:63.4pt;height:5.1pt;z-index:15733760;mso-wrap-distance-left:0;mso-wrap-distance-right:0;mso-position-horizontal-relative:page" coordsize="8051,647" o:gfxdata="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">
+              <v:group w14:anchorId="71E45D76" id="Group 29" o:spid="_x0000_s1026" style="position:absolute;margin-left:212.5pt;margin-top:8.95pt;width:63.4pt;height:5.1pt;z-index:15733760;mso-wrap-distance-left:0;mso-wrap-distance-right:0;mso-position-horizontal-relative:page" coordsize="8051,647" o:gfxdata="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">
                 <v:shape id="Graphic 30" o:spid="_x0000_s1027" style="position:absolute;width:8051;height:647;visibility:visible;mso-wrap-style:square;v-text-anchor:top" coordsize="805180,64769" o:gfxdata="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" path="m772616,64384r-740424,l19661,61854,9428,54955,2529,44723,,32192,2529,19661,9428,9429,19661,2529,32192,,772616,r12531,2529l795380,9429r6899,10232l804809,32192r-2530,12531l795380,54955r-10233,6899l772616,64384xe" fillcolor="#e3e8e9" stroked="f">
                   <v:path arrowok="t"/>
                 </v:shape>
@@ -4739,7 +4748,7 @@
           </mc:Choice>
           <mc:Fallback>
             <w:pict>
-              <v:group w14:anchorId="3F71A25E" id="Group 32" o:spid="_x0000_s1026" style="position:absolute;margin-left:212.5pt;margin-top:14.15pt;width:63.4pt;height:4.45pt;z-index:15734272;mso-wrap-distance-left:0;mso-wrap-distance-right:0;mso-position-horizontal-relative:page" coordsize="8051,565" o:gfxdata="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">
+              <v:group w14:anchorId="62395747" id="Group 32" o:spid="_x0000_s1026" style="position:absolute;margin-left:212.5pt;margin-top:14.15pt;width:63.4pt;height:4.45pt;z-index:15734272;mso-wrap-distance-left:0;mso-wrap-distance-right:0;mso-position-horizontal-relative:page" coordsize="8051,565" o:gfxdata="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">
                 <v:shape id="Graphic 33" o:spid="_x0000_s1027" style="position:absolute;width:8051;height:565;visibility:visible;mso-wrap-style:square;v-text-anchor:top" coordsize="805180,56515" o:gfxdata="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" path="m776640,56336r-748472,l17203,54123,8250,48086,2213,39132,,28168,2213,17203,8250,8250,17203,2213,28168,,776640,r10965,2213l796558,8250r6037,8953l804809,28168r-2214,10964l796558,48086r-8953,6037l776640,56336xe" fillcolor="#e3e8e9" stroked="f">
                   <v:path arrowok="t"/>
                 </v:shape>
@@ -4867,7 +4876,7 @@
           </mc:Choice>
           <mc:Fallback>
             <w:pict>
-              <v:shape w14:anchorId="3E86CC56" id="Graphic 35" o:spid="_x0000_s1026" style="position:absolute;margin-left:0;margin-top:172.25pt;width:595.5pt;height:3pt;z-index:15734784;visibility:visible;mso-wrap-style:square;mso-wrap-distance-left:0;mso-wrap-distance-top:0;mso-wrap-distance-right:0;mso-wrap-distance-bottom:0;mso-position-horizontal:absolute;mso-position-horizontal-relative:page;mso-position-vertical:absolute;mso-position-vertical-relative:page;v-text-anchor:top" coordsize="7562850,38100" o:gfxdata="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" path="m7562849,r,38099l,38099,,,7562849,xe" fillcolor="black" stroked="f">
+              <v:shape w14:anchorId="3A5C8CAD" id="Graphic 35" o:spid="_x0000_s1026" style="position:absolute;margin-left:0;margin-top:172.25pt;width:595.5pt;height:3pt;z-index:15734784;visibility:visible;mso-wrap-style:square;mso-wrap-distance-left:0;mso-wrap-distance-top:0;mso-wrap-distance-right:0;mso-wrap-distance-bottom:0;mso-position-horizontal:absolute;mso-position-horizontal-relative:page;mso-position-vertical:absolute;mso-position-vertical-relative:page;v-text-anchor:top" coordsize="7562850,38100" o:gfxdata="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" path="m7562849,r,38099l,38099,,,7562849,xe" fillcolor="black" stroked="f">
                 <v:path arrowok="t"/>
                 <w10:wrap anchorx="page" anchory="page"/>
               </v:shape>
@@ -4962,7 +4971,7 @@
           </mc:Choice>
           <mc:Fallback>
             <w:pict>
-              <v:group w14:anchorId="299FE129" id="Group 36" o:spid="_x0000_s1026" style="width:490.95pt;height:.75pt;mso-position-horizontal-relative:char;mso-position-vertical-relative:line" coordsize="62350,95" o:gfxdata="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">
+              <v:group w14:anchorId="4E5D45F1" id="Group 36" o:spid="_x0000_s1026" style="width:490.95pt;height:.75pt;mso-position-horizontal-relative:char;mso-position-vertical-relative:line" coordsize="62350,95" o:gfxdata="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">
                 <v:shape id="Graphic 37" o:spid="_x0000_s1027" style="position:absolute;top:47;width:62350;height:13;visibility:visible;mso-wrap-style:square;v-text-anchor:top" coordsize="6235065,1270" o:gfxdata="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" path="m6235007,l,e" filled="f" strokeweight=".26456mm">
                   <v:path arrowok="t"/>
                 </v:shape>

</xml_diff>